<commit_message>
Retitle the Ha Long Bay advertisement
Swaps the title for one that ties to the overnight cruise the call to
action asks for, rather than to the picture above it.

Co-Authored-By: Claude Opus 5 <noreply@anthropic.com>
Claude-Session: https://claude.ai/code/session_01Su2Dt35D5yzXeQzWPqrwb6
</commit_message>
<xml_diff>
--- a/Ha-Long-Bay-Advertisement.docx
+++ b/Ha-Long-Bay-Advertisement.docx
@@ -61,7 +61,7 @@
           <w:sz w:val="28"/>
           <w:szCs w:val="28"/>
         </w:rPr>
-        <w:t xml:space="preserve">Sail Into a Postcard: Ha Long Bay, Vietnam</w:t>
+        <w:t xml:space="preserve">Wake Up in the Middle of a Wonder: Ha Long Bay, Vietnam</w:t>
       </w:r>
     </w:p>
     <w:p>
@@ -209,7 +209,7 @@
         </w:rPr>
         <w:t xml:space="preserve">Ha Long Bay. </w:t>
       </w:r>
-      <w:hyperlink w:history="1" r:id="rIdrb2ymtczp0aqli0ykuf6n">
+      <w:hyperlink w:history="1" r:id="rIdtw9tphd9p976pvbah2m3q">
         <w:r>
           <w:rPr>
             <w:rFonts w:ascii="Calibri" w:cs="Calibri" w:eastAsia="Calibri" w:hAnsi="Calibri"/>

</xml_diff>

<commit_message>
Put the caption and source link in Bookman 12 as well
The caption and hyperlink were still Calibri at 10pt, carried over from
matching the reference handout's caption styling. The brief asks for Bookman
Old Style at 12 throughout, so every run now carries it: 12 of 13 runs at
12pt, with only the title larger.

Co-Authored-By: Claude Opus 5 <noreply@anthropic.com>
Claude-Session: https://claude.ai/code/session_01Su2Dt35D5yzXeQzWPqrwb6
</commit_message>
<xml_diff>
--- a/Ha-Long-Bay-Advertisement.docx
+++ b/Ha-Long-Bay-Advertisement.docx
@@ -183,39 +183,39 @@
       </w:pPr>
       <w:r>
         <w:rPr>
-          <w:rFonts w:ascii="Calibri" w:cs="Calibri" w:eastAsia="Calibri" w:hAnsi="Calibri"/>
+          <w:rFonts w:ascii="Bookman Old Style" w:cs="Bookman Old Style" w:eastAsia="Bookman Old Style" w:hAnsi="Bookman Old Style"/>
           <w:i/>
           <w:iCs/>
-          <w:sz w:val="20"/>
-          <w:szCs w:val="20"/>
+          <w:sz w:val="24"/>
+          <w:szCs w:val="24"/>
         </w:rPr>
         <w:t xml:space="preserve">Illustration by the author. Information: </w:t>
       </w:r>
       <w:r>
         <w:rPr>
-          <w:rFonts w:ascii="Calibri" w:cs="Calibri" w:eastAsia="Calibri" w:hAnsi="Calibri"/>
-          <w:sz w:val="20"/>
-          <w:szCs w:val="20"/>
+          <w:rFonts w:ascii="Bookman Old Style" w:cs="Bookman Old Style" w:eastAsia="Bookman Old Style" w:hAnsi="Bookman Old Style"/>
+          <w:sz w:val="24"/>
+          <w:szCs w:val="24"/>
         </w:rPr>
         <w:t xml:space="preserve">UNESCO World Heritage Centre. (n.d.). </w:t>
       </w:r>
       <w:r>
         <w:rPr>
-          <w:rFonts w:ascii="Calibri" w:cs="Calibri" w:eastAsia="Calibri" w:hAnsi="Calibri"/>
+          <w:rFonts w:ascii="Bookman Old Style" w:cs="Bookman Old Style" w:eastAsia="Bookman Old Style" w:hAnsi="Bookman Old Style"/>
           <w:i/>
           <w:iCs/>
-          <w:sz w:val="20"/>
-          <w:szCs w:val="20"/>
+          <w:sz w:val="24"/>
+          <w:szCs w:val="24"/>
         </w:rPr>
         <w:t xml:space="preserve">Ha Long Bay. </w:t>
       </w:r>
-      <w:hyperlink w:history="1" r:id="rIdtw9tphd9p976pvbah2m3q">
+      <w:hyperlink w:history="1" r:id="rIdbmxed_ruqi5aa1tx42s0z">
         <w:r>
           <w:rPr>
-            <w:rFonts w:ascii="Calibri" w:cs="Calibri" w:eastAsia="Calibri" w:hAnsi="Calibri"/>
+            <w:rFonts w:ascii="Bookman Old Style" w:cs="Bookman Old Style" w:eastAsia="Bookman Old Style" w:hAnsi="Bookman Old Style"/>
             <w:color w:val="1155CC"/>
-            <w:sz w:val="20"/>
-            <w:szCs w:val="20"/>
+            <w:sz w:val="24"/>
+            <w:szCs w:val="24"/>
             <w:u w:val="single"/>
           </w:rPr>
           <w:t xml:space="preserve">https://whc.unesco.org/</w:t>

</xml_diff>

<commit_message>
Use the supplied Ha Long Bay photograph and cite its source
Replaces the drawn illustration with the photograph provided by the author,
credited to Paradise Vietnam in the same format as the reference handout:
organisation, date, italic title, live link.

Drops the illustration and the separate UNESCO line with it - the caption now
credits one image to one source, so there is nothing left to disambiguate.

Co-Authored-By: Claude Opus 5 <noreply@anthropic.com>
Claude-Session: https://claude.ai/code/session_01Su2Dt35D5yzXeQzWPqrwb6
</commit_message>
<xml_diff>
--- a/Ha-Long-Bay-Advertisement.docx
+++ b/Ha-Long-Bay-Advertisement.docx
@@ -10,7 +10,7 @@
       <w:r>
         <w:drawing>
           <wp:inline distT="0" distB="0" distL="0" distR="0">
-            <wp:extent cx="5143500" cy="2895600"/>
+            <wp:extent cx="5143500" cy="2886075"/>
             <wp:effectExtent t="0" r="0" b="0" l="0"/>
             <wp:docPr id="1" name="" descr="" title=""/>
             <wp:cNvGraphicFramePr>
@@ -35,7 +35,7 @@
                   <pic:spPr bwMode="auto">
                     <a:xfrm>
                       <a:off x="0" y="0"/>
-                      <a:ext cx="5143500" cy="2895600"/>
+                      <a:ext cx="5143500" cy="2886075"/>
                     </a:xfrm>
                     <a:prstGeom prst="rect">
                       <a:avLst/>
@@ -184,32 +184,22 @@
       <w:r>
         <w:rPr>
           <w:rFonts w:ascii="Bookman Old Style" w:cs="Bookman Old Style" w:eastAsia="Bookman Old Style" w:hAnsi="Bookman Old Style"/>
+          <w:sz w:val="24"/>
+          <w:szCs w:val="24"/>
+        </w:rPr>
+        <w:t xml:space="preserve">Paradise Vietnam. (n.d.). </w:t>
+      </w:r>
+      <w:r>
+        <w:rPr>
+          <w:rFonts w:ascii="Bookman Old Style" w:cs="Bookman Old Style" w:eastAsia="Bookman Old Style" w:hAnsi="Bookman Old Style"/>
           <w:i/>
           <w:iCs/>
           <w:sz w:val="24"/>
           <w:szCs w:val="24"/>
         </w:rPr>
-        <w:t xml:space="preserve">Illustration by the author. Information: </w:t>
-      </w:r>
-      <w:r>
-        <w:rPr>
-          <w:rFonts w:ascii="Bookman Old Style" w:cs="Bookman Old Style" w:eastAsia="Bookman Old Style" w:hAnsi="Bookman Old Style"/>
-          <w:sz w:val="24"/>
-          <w:szCs w:val="24"/>
-        </w:rPr>
-        <w:t xml:space="preserve">UNESCO World Heritage Centre. (n.d.). </w:t>
-      </w:r>
-      <w:r>
-        <w:rPr>
-          <w:rFonts w:ascii="Bookman Old Style" w:cs="Bookman Old Style" w:eastAsia="Bookman Old Style" w:hAnsi="Bookman Old Style"/>
-          <w:i/>
-          <w:iCs/>
-          <w:sz w:val="24"/>
-          <w:szCs w:val="24"/>
-        </w:rPr>
-        <w:t xml:space="preserve">Ha Long Bay. </w:t>
-      </w:r>
-      <w:hyperlink w:history="1" r:id="rIdbmxed_ruqi5aa1tx42s0z">
+        <w:t xml:space="preserve">Ha Long Bay Images. </w:t>
+      </w:r>
+      <w:hyperlink w:history="1" r:id="rIdws3iomortt1brpgtvveoj">
         <w:r>
           <w:rPr>
             <w:rFonts w:ascii="Bookman Old Style" w:cs="Bookman Old Style" w:eastAsia="Bookman Old Style" w:hAnsi="Bookman Old Style"/>
@@ -218,7 +208,7 @@
             <w:szCs w:val="24"/>
             <w:u w:val="single"/>
           </w:rPr>
-          <w:t xml:space="preserve">https://whc.unesco.org/</w:t>
+          <w:t xml:space="preserve">https://www.paradisevietnam.com/en/halong-bay-images</w:t>
         </w:r>
       </w:hyperlink>
     </w:p>

</xml_diff>

<commit_message>
Trim the advertisement to a single page
Cuts the four paragraphs from 355 words to 211 so the whole piece, photo
included, lands on one sheet of long bond.

Each section keeps its job: the thesis keeps the photographs-versus-person
hook, the evidence keeps the UNESCO listing, the caves and the floating
villages, the counterargument keeps both objections and the Lan Ha answer,
and the call to action keeps the route and the sunrise.

LibreOffice cannot open docx in this container, so page count was measured
instead by laying the extracted runs out in Chromium at the real column
width and line spacing: 651pt of content against 792pt of usable page, about
ten spare lines. The measurement falls back to a narrower serif than Bookman
Old Style, but the margin absorbs a 25% wider face.

Co-Authored-By: Claude Opus 5 <noreply@anthropic.com>
Claude-Session: https://claude.ai/code/session_01Su2Dt35D5yzXeQzWPqrwb6
</commit_message>
<xml_diff>
--- a/Ha-Long-Bay-Advertisement.docx
+++ b/Ha-Long-Bay-Advertisement.docx
@@ -89,7 +89,7 @@
           <w:sz w:val="24"/>
           <w:szCs w:val="24"/>
         </w:rPr>
-        <w:t xml:space="preserve">There are places you look at in photographs and places you feel the moment you arrive. Ha Long Bay in northern Vietnam is the second kind. Almost two thousand limestone islands rise straight out of emerald water, and a boat is the only way through them. If you are choosing one destination in Southeast Asia, choose the one that has been shaped for millions of years and can still be crossed in an afternoon.</w:t>
+        <w:t xml:space="preserve">Some places look better in photographs than in person. Ha Long Bay is the opposite. Nearly two thousand limestone islands rise straight out of emerald water in northern Vietnam, and the only way through them is by boat. Make it your next destination.</w:t>
       </w:r>
     </w:p>
     <w:p>
@@ -117,7 +117,7 @@
           <w:sz w:val="24"/>
           <w:szCs w:val="24"/>
         </w:rPr>
-        <w:t xml:space="preserve">Ha Long Bay is a UNESCO World Heritage Site, recognised for limestone karsts that took roughly 500 million years to form. Visitors cruise between the islands on traditional wooden junks, kayak into hidden lagoons that open only at low tide, and climb into caves such as Sung Sot, whose chambers are large enough to hold hundreds of people. Floating fishing villages still work the same waters, so the bay is a living community and not only a view. Meals are served on deck as the islands slide past, and an overnight cruise lets you watch the sun set and rise over the same horizon.</w:t>
+        <w:t xml:space="preserve">Ha Long Bay is a UNESCO World Heritage Site, its karsts shaped over roughly 500 million years. Visitors cruise between the islands on wooden junks, kayak into lagoons that open only at low tide, and walk through caves such as Sung Sot, large enough to hold hundreds of people. Floating fishing villages still work these waters, so the bay is a living place and not only a view.</w:t>
       </w:r>
     </w:p>
     <w:p>
@@ -145,7 +145,7 @@
           <w:sz w:val="24"/>
           <w:szCs w:val="24"/>
         </w:rPr>
-        <w:t xml:space="preserve">Some travellers worry that Ha Long Bay has become too crowded, or that a cruise costs more than the rest of their trip. It is a fair concern in peak season. The answer is simply to choose well: routes through Lan Ha Bay and Bai Tu Long carry a fraction of the traffic and show the same limestone scenery, and cruises run at every price level, from shared day trips to small overnight boats. Travelling outside the summer months gives you quieter water and softer light for photographs.</w:t>
+        <w:t xml:space="preserve">Some travellers say the bay is crowded and that cruises cost too much. In peak season that is fair. The answer is to choose well: Lan Ha Bay and Bai Tu Long carry far less traffic with the same scenery, and cruises run at every price, from day trips to small overnight boats.</w:t>
       </w:r>
     </w:p>
     <w:p>
@@ -173,7 +173,7 @@
           <w:sz w:val="24"/>
           <w:szCs w:val="24"/>
         </w:rPr>
-        <w:t xml:space="preserve">Do not leave Ha Long Bay on a list of places you meant to see. Fly into Hanoi, take the two-and-a-half-hour transfer to the coast, and book at least one night on the water. Stand on the deck at sunrise while the mist lifts off the islands, and you will understand why the photographs never quite manage it. Book your cruise and let Ha Long Bay do the rest.</w:t>
+        <w:t xml:space="preserve">Do not leave Ha Long Bay on a list of places you meant to see. Fly into Hanoi, take the transfer to the coast, and book one night on the water. Stand on deck at sunrise, and you will see what the photographs miss. Book your cruise.</w:t>
       </w:r>
     </w:p>
     <w:p>
@@ -199,7 +199,7 @@
         </w:rPr>
         <w:t xml:space="preserve">Ha Long Bay Images. </w:t>
       </w:r>
-      <w:hyperlink w:history="1" r:id="rIdws3iomortt1brpgtvveoj">
+      <w:hyperlink w:history="1" r:id="rIdfsmgltszeupqxrjqay68z">
         <w:r>
           <w:rPr>
             <w:rFonts w:ascii="Bookman Old Style" w:cs="Bookman Old Style" w:eastAsia="Bookman Old Style" w:hAnsi="Bookman Old Style"/>

</xml_diff>